<commit_message>
TFM: afegir l'apartat 4.6.1 sobre el ceptòmetre AccuPAR LP-80
Insereix la descripció de la mesura de la fPAR i del LAI amb el ceptòmetre
AccuPAR LP-80 dins de Mesures de camp i validació, i afegeix la referència de
Monteith (1977) a la bibliografia en ordre alfabètic.

Co-Authored-By: Claude Opus 5 <noreply@anthropic.com>
Claude-Session: https://claude.ai/code/session_015S8J5VNEjqUNJtc1c5qPf1
</commit_message>
<xml_diff>
--- a/TFM_Pau_Planes_IRTA_v3.docx
+++ b/TFM_Pau_Planes_IRTA_v3.docx
@@ -7463,6 +7463,65 @@
     </w:p>
     <w:p>
       <w:pPr>
+        <w:pStyle w:val="Ttulo3"/>
+        <w:rPr>
+          <w:lang w:val="es-ES"/>
+        </w:rPr>
+      </w:pPr>
+      <w:r>
+        <w:rPr>
+          <w:rFonts w:cs="Arial" w:ascii="Arial" w:hAnsi="Arial"/>
+          <w:b/>
+          <w:sz w:val="24"/>
+          <w:lang w:val="es-ES"/>
+        </w:rPr>
+        <w:t>4.6.1. Mesura de la fPAR i del LAI amb el ceptòmetre AccuPAR LP-80</w:t>
+      </w:r>
+    </w:p>
+    <w:p>
+      <w:pPr>
+        <w:rPr>
+          <w:lang w:val="es-ES"/>
+        </w:rPr>
+      </w:pPr>
+      <w:r>
+        <w:rPr>
+          <w:rFonts w:cs="Arial"/>
+          <w:lang w:val="es-ES"/>
+        </w:rPr>
+        <w:t>La radiació que impulsa la fotosíntesi és la radiació fotosintèticament activa (PAR), que ocupa la franja de l'espectre compresa entre 400 i 700 nm. Monteith (1977) va observar que la producció de matèria seca d'una coberta vegetal depèn directament de la quantitat de PAR que el dosser arriba a interceptar, la fracció que es coneix com a fPAR. Dit d'una altra manera, la fPAR indica quina proporció de la llum d'aquesta franja aprofita el dosser. Per la seva banda, l'índex d'àrea foliar (LAI, Leaf Area Index) descriu la superfície foliar total per unitat de superfície de sòl o de dosser, i està relacionat directament amb la capacitat de la planta d'interceptar radiació, fotosintetitzar i produir biomassa.</w:t>
+      </w:r>
+    </w:p>
+    <w:p>
+      <w:pPr>
+        <w:rPr>
+          <w:lang w:val="es-ES"/>
+        </w:rPr>
+      </w:pPr>
+      <w:r>
+        <w:rPr>
+          <w:rFonts w:cs="Arial"/>
+          <w:lang w:val="es-ES"/>
+        </w:rPr>
+        <w:t>Sota una coberta vegetal, la radiació pot passar d'insolació plena a valors propers a zero en pocs centímetres. Per això, mesurar la fPAR amb fiabilitat obliga a prendre moltes lectures en punts i alçades diferents per sota del dosser. Totes dues variables serveixen per seguir el desenvolupament i el creixement del cultiu, ja que una fPAR alta apunta a una bona absorció de radiació per a la fotosíntesi. També permeten estimar la producció primària, és a dir, la biomassa que pot generar un cultiu o un ecosistema, i s'incorporen als models climàtics i ecològics que prediuen l'intercanvi de carboni entre la biosfera i l'atmosfera.</w:t>
+      </w:r>
+    </w:p>
+    <w:p>
+      <w:pPr>
+        <w:rPr>
+          <w:lang w:val="es-ES"/>
+        </w:rPr>
+      </w:pPr>
+      <w:r>
+        <w:rPr>
+          <w:rFonts w:cs="Arial"/>
+          <w:lang w:val="es-ES"/>
+        </w:rPr>
+        <w:t>El ceptòmetre AccuPAR LP-80 de METER Group mesura la radiació PAR i la fracció que intercepta la vegetació, i a partir d'aquesta fracció estima el LAI de manera indirecta. Porta 80 sensors de PAR muntats en una barra i un sensor de PAR extern, que permet registrar alhora la radiació per sobre i per sota de la coberta. Per prendre una mesura només cal situar la barra en els punts d'interès sota el dosser: l'equip registra la radiació incident i la transmesa, i calcula automàticament la fracció interceptada i el LAI en temps real, cosa que permet comprovar sobre el terreny si els valors són coherents amb l'assaig. És un equip portàtil, alimentat amb piles, de 0,55 kg i un metre de llargada, amb memòria per a més de 4.000 dades i descàrrega per cable USB. S'utilitza per caracteritzar l'estructura de les cobertes vegetals i l'ús que fan de la PAR, per quantificar la radiació interceptada en estudis d'eficiència en l'ús de l'aigua o de competència entre cultiu i males herbes, i per alimentar models agrícoles i forestals que avaluen l'efecte de les pràctiques de maneig i dels canvis ambientals sobre la productivitat.</w:t>
+      </w:r>
+    </w:p>
+    <w:p>
+      <w:pPr>
         <w:jc w:val="left"/>
         <w:rPr>
           <w:lang w:val="es-ES"/>
@@ -8403,6 +8462,18 @@
           <w:rFonts w:cs="Arial"/>
         </w:rPr>
         <w:t>Evaluation of soil and vegetation heat flux predictions using a simple two-source model with radiometric temperatures for partial canopy cover. Agricultural and Forest Meteorology, 94(1), 13–29. https://doi.org/10.1016/S0168-1923(99)00005-2</w:t>
+      </w:r>
+    </w:p>
+    <w:p>
+      <w:pPr>
+        <w:spacing w:after="160"/>
+        <w:ind w:left="709" w:hanging="709"/>
+      </w:pPr>
+      <w:r>
+        <w:rPr>
+          <w:rFonts w:cs="Arial"/>
+        </w:rPr>
+        <w:t>Monteith, J. L. (1977). Climate and the efficiency of crop production in Britain. Philosophical Transactions of the Royal Society of London. Series B, Biological Sciences, 281(980), 277–294. https://doi.org/10.1098/rstb.1977.0140</w:t>
       </w:r>
     </w:p>
     <w:p>
@@ -9202,10 +9273,11 @@
       <w:outlineLvl w:val="2"/>
     </w:pPr>
     <w:rPr>
-      <w:rFonts w:asciiTheme="majorHAnsi" w:eastAsiaTheme="majorEastAsia" w:hAnsiTheme="majorHAnsi" w:cstheme="majorBidi"/>
+      <w:rFonts w:asciiTheme="majorHAnsi" w:eastAsiaTheme="majorEastAsia" w:hAnsiTheme="majorHAnsi" w:cstheme="majorBidi" w:ascii="Arial" w:hAnsi="Arial"/>
       <w:b/>
       <w:bCs/>
       <w:color w:val="000000"/>
+      <w:sz w:val="24"/>
     </w:rPr>
   </w:style>
   <w:style w:type="paragraph" w:styleId="Ttulo4">

</xml_diff>

<commit_message>
TFM: afegir la taula de sensors instal·lats a la parcel·la
Crea la Taula 2 a l'apartat 4.3 amb els sensors de flux de saba, els
cabalímetres, els sensors d'humitat del sòl, els dendròmetres i l'estació
meteorològica. La funció de cada sensor ja hi és redactada i les columnes de
model i fabricant, nombre d'unitats, ubicació per tractament i bloc, i
freqüència i sistema de registre queden buides per completar.

Renumera les taules posteriors a 3 i 4 i actualitza les crides del text.

Co-Authored-By: Claude Opus 5 <noreply@anthropic.com>
Claude-Session: https://claude.ai/code/session_015S8J5VNEjqUNJtc1c5qPf1
</commit_message>
<xml_diff>
--- a/TFM_Pau_Planes_IRTA_v3.docx
+++ b/TFM_Pau_Planes_IRTA_v3.docx
@@ -6716,6 +6716,738 @@
     </w:p>
     <w:p>
       <w:pPr>
+        <w:rPr>
+          <w:lang w:val="es-ES"/>
+        </w:rPr>
+      </w:pPr>
+      <w:r>
+        <w:rPr>
+          <w:lang w:val="es-ES"/>
+        </w:rPr>
+        <w:t>La Taula 2 recull els sensors instal·lats a la parcel·la, la funció que fa cadascun dins de l'assaig i les característiques tècniques que cal documentar.</w:t>
+      </w:r>
+    </w:p>
+    <w:p>
+      <w:pPr>
+        <w:pStyle w:val="Descripcin"/>
+        <w:jc w:val="left"/>
+        <w:rPr>
+          <w:lang w:val="es-ES"/>
+        </w:rPr>
+      </w:pPr>
+      <w:r>
+        <w:rPr>
+          <w:rFonts w:ascii="Arial" w:hAnsi="Arial" w:cs="Arial"/>
+          <w:b/>
+          <w:sz w:val="20"/>
+        </w:rPr>
+        <w:t xml:space="preserve">Taula </w:t>
+      </w:r>
+      <w:r>
+        <w:rPr>
+          <w:rFonts w:ascii="Arial" w:hAnsi="Arial" w:cs="Arial"/>
+          <w:b/>
+          <w:sz w:val="20"/>
+        </w:rPr>
+        <w:fldChar w:fldCharType="begin"/>
+      </w:r>
+      <w:r>
+        <w:rPr>
+          <w:rFonts w:ascii="Arial" w:hAnsi="Arial" w:cs="Arial"/>
+          <w:b/>
+          <w:sz w:val="20"/>
+        </w:rPr>
+        <w:instrText xml:space="preserve"> SEQ Taula \* ARABIC </w:instrText>
+      </w:r>
+      <w:r>
+        <w:rPr>
+          <w:rFonts w:ascii="Arial" w:hAnsi="Arial" w:cs="Arial"/>
+          <w:b/>
+          <w:sz w:val="20"/>
+        </w:rPr>
+        <w:fldChar w:fldCharType="separate"/>
+      </w:r>
+      <w:r>
+        <w:rPr>
+          <w:rFonts w:ascii="Arial" w:hAnsi="Arial" w:cs="Arial"/>
+          <w:b/>
+          <w:sz w:val="20"/>
+        </w:rPr>
+        <w:t>2</w:t>
+      </w:r>
+      <w:r>
+        <w:rPr>
+          <w:rFonts w:ascii="Arial" w:hAnsi="Arial" w:cs="Arial"/>
+          <w:b/>
+          <w:sz w:val="20"/>
+        </w:rPr>
+        <w:fldChar w:fldCharType="end"/>
+      </w:r>
+      <w:r>
+        <w:rPr>
+          <w:rFonts w:ascii="Arial" w:hAnsi="Arial" w:cs="Arial"/>
+          <w:b w:val="0"/>
+          <w:sz w:val="20"/>
+        </w:rPr>
+        <w:t>. Sensors instal·lats a la parcel·la experimental, funció de cadascun i característiques tècniques.</w:t>
+      </w:r>
+    </w:p>
+    <w:tbl>
+      <w:tblPr>
+        <w:tblStyle w:val="Tablaconcuadrcula"/>
+        <w:tblW w:type="auto" w:w="0"/>
+        <w:jc w:val="center"/>
+        <w:tblLook w:firstColumn="1" w:firstRow="1" w:lastColumn="0" w:lastRow="0" w:noHBand="0" w:noVBand="1" w:val="04A0"/>
+      </w:tblPr>
+      <w:tblGrid>
+        <w:gridCol w:w="1568"/>
+        <w:gridCol w:w="1568"/>
+        <w:gridCol w:w="1568"/>
+        <w:gridCol w:w="1568"/>
+        <w:gridCol w:w="1568"/>
+        <w:gridCol w:w="1568"/>
+      </w:tblGrid>
+      <w:tr>
+        <w:tc>
+          <w:tcPr>
+            <w:tcW w:type="dxa" w:w="1531"/>
+          </w:tcPr>
+          <w:p>
+            <w:pPr>
+              <w:jc w:val="center"/>
+            </w:pPr>
+            <w:r>
+              <w:rPr>
+                <w:rFonts w:ascii="Arial" w:hAnsi="Arial" w:cs="Arial"/>
+                <w:b/>
+                <w:sz w:val="19"/>
+              </w:rPr>
+              <w:t>Sensor o equip</w:t>
+            </w:r>
+          </w:p>
+        </w:tc>
+        <w:tc>
+          <w:tcPr>
+            <w:tcW w:type="dxa" w:w="2608"/>
+          </w:tcPr>
+          <w:p>
+            <w:pPr>
+              <w:jc w:val="center"/>
+            </w:pPr>
+            <w:r>
+              <w:rPr>
+                <w:rFonts w:ascii="Arial" w:hAnsi="Arial" w:cs="Arial"/>
+                <w:b/>
+                <w:sz w:val="19"/>
+              </w:rPr>
+              <w:t>Funció dins de l'assaig</w:t>
+            </w:r>
+          </w:p>
+        </w:tc>
+        <w:tc>
+          <w:tcPr>
+            <w:tcW w:type="dxa" w:w="1417"/>
+          </w:tcPr>
+          <w:p>
+            <w:pPr>
+              <w:jc w:val="center"/>
+            </w:pPr>
+            <w:r>
+              <w:rPr>
+                <w:rFonts w:ascii="Arial" w:hAnsi="Arial" w:cs="Arial"/>
+                <w:b/>
+                <w:sz w:val="19"/>
+              </w:rPr>
+              <w:t>Model i fabricant</w:t>
+            </w:r>
+          </w:p>
+        </w:tc>
+        <w:tc>
+          <w:tcPr>
+            <w:tcW w:type="dxa" w:w="510"/>
+          </w:tcPr>
+          <w:p>
+            <w:pPr>
+              <w:jc w:val="center"/>
+            </w:pPr>
+            <w:r>
+              <w:rPr>
+                <w:rFonts w:ascii="Arial" w:hAnsi="Arial" w:cs="Arial"/>
+                <w:b/>
+                <w:sz w:val="19"/>
+              </w:rPr>
+              <w:t>Nre.</w:t>
+            </w:r>
+          </w:p>
+        </w:tc>
+        <w:tc>
+          <w:tcPr>
+            <w:tcW w:type="dxa" w:w="1474"/>
+          </w:tcPr>
+          <w:p>
+            <w:pPr>
+              <w:jc w:val="center"/>
+            </w:pPr>
+            <w:r>
+              <w:rPr>
+                <w:rFonts w:ascii="Arial" w:hAnsi="Arial" w:cs="Arial"/>
+                <w:b/>
+                <w:sz w:val="19"/>
+              </w:rPr>
+              <w:t>Tractaments i blocs</w:t>
+            </w:r>
+          </w:p>
+        </w:tc>
+        <w:tc>
+          <w:tcPr>
+            <w:tcW w:type="dxa" w:w="1531"/>
+          </w:tcPr>
+          <w:p>
+            <w:pPr>
+              <w:jc w:val="center"/>
+            </w:pPr>
+            <w:r>
+              <w:rPr>
+                <w:rFonts w:ascii="Arial" w:hAnsi="Arial" w:cs="Arial"/>
+                <w:b/>
+                <w:sz w:val="19"/>
+              </w:rPr>
+              <w:t>Freqüència i sistema de registre</w:t>
+            </w:r>
+          </w:p>
+        </w:tc>
+      </w:tr>
+      <w:tr>
+        <w:tc>
+          <w:tcPr>
+            <w:tcW w:type="dxa" w:w="1531"/>
+          </w:tcPr>
+          <w:p>
+            <w:r>
+              <w:rPr>
+                <w:rFonts w:ascii="Arial" w:hAnsi="Arial" w:cs="Arial"/>
+                <w:b/>
+                <w:sz w:val="19"/>
+              </w:rPr>
+              <w:t>Sensors de flux de saba (sap flow)</w:t>
+            </w:r>
+          </w:p>
+        </w:tc>
+        <w:tc>
+          <w:tcPr>
+            <w:tcW w:type="dxa" w:w="2608"/>
+          </w:tcPr>
+          <w:p>
+            <w:r>
+              <w:rPr>
+                <w:rFonts w:ascii="Arial" w:hAnsi="Arial" w:cs="Arial"/>
+                <w:b w:val="0"/>
+                <w:sz w:val="19"/>
+              </w:rPr>
+              <w:t>Mesuren de manera contínua i directa la transpiració del cep. Són la referència per contrastar la transpiració que estima el model TSEB.</w:t>
+            </w:r>
+          </w:p>
+        </w:tc>
+        <w:tc>
+          <w:tcPr>
+            <w:tcW w:type="dxa" w:w="1417"/>
+          </w:tcPr>
+          <w:p>
+            <w:r>
+              <w:rPr>
+                <w:rFonts w:ascii="Arial" w:hAnsi="Arial" w:cs="Arial"/>
+                <w:b w:val="0"/>
+                <w:sz w:val="19"/>
+              </w:rPr>
+            </w:r>
+          </w:p>
+        </w:tc>
+        <w:tc>
+          <w:tcPr>
+            <w:tcW w:type="dxa" w:w="510"/>
+          </w:tcPr>
+          <w:p>
+            <w:r>
+              <w:rPr>
+                <w:rFonts w:ascii="Arial" w:hAnsi="Arial" w:cs="Arial"/>
+                <w:b w:val="0"/>
+                <w:sz w:val="19"/>
+              </w:rPr>
+            </w:r>
+          </w:p>
+        </w:tc>
+        <w:tc>
+          <w:tcPr>
+            <w:tcW w:type="dxa" w:w="1474"/>
+          </w:tcPr>
+          <w:p>
+            <w:r>
+              <w:rPr>
+                <w:rFonts w:ascii="Arial" w:hAnsi="Arial" w:cs="Arial"/>
+                <w:b w:val="0"/>
+                <w:sz w:val="19"/>
+              </w:rPr>
+            </w:r>
+          </w:p>
+        </w:tc>
+        <w:tc>
+          <w:tcPr>
+            <w:tcW w:type="dxa" w:w="1531"/>
+          </w:tcPr>
+          <w:p>
+            <w:r>
+              <w:rPr>
+                <w:rFonts w:ascii="Arial" w:hAnsi="Arial" w:cs="Arial"/>
+                <w:b w:val="0"/>
+                <w:sz w:val="19"/>
+              </w:rPr>
+            </w:r>
+          </w:p>
+        </w:tc>
+      </w:tr>
+      <w:tr>
+        <w:tc>
+          <w:tcPr>
+            <w:tcW w:type="dxa" w:w="1531"/>
+          </w:tcPr>
+          <w:p>
+            <w:r>
+              <w:rPr>
+                <w:rFonts w:ascii="Arial" w:hAnsi="Arial" w:cs="Arial"/>
+                <w:b/>
+                <w:sz w:val="19"/>
+              </w:rPr>
+              <w:t>Cabalímetres</w:t>
+            </w:r>
+          </w:p>
+        </w:tc>
+        <w:tc>
+          <w:tcPr>
+            <w:tcW w:type="dxa" w:w="2608"/>
+          </w:tcPr>
+          <w:p>
+            <w:r>
+              <w:rPr>
+                <w:rFonts w:ascii="Arial" w:hAnsi="Arial" w:cs="Arial"/>
+                <w:b w:val="0"/>
+                <w:sz w:val="19"/>
+              </w:rPr>
+              <w:t>Registren el volum d'aigua de reg aplicat a cada tractament, que es rega de manera independent. Permeten relacionar l'ETa estimada amb el consum real d'aigua de cada maneig de capçada.</w:t>
+            </w:r>
+          </w:p>
+        </w:tc>
+        <w:tc>
+          <w:tcPr>
+            <w:tcW w:type="dxa" w:w="1417"/>
+          </w:tcPr>
+          <w:p>
+            <w:r>
+              <w:rPr>
+                <w:rFonts w:ascii="Arial" w:hAnsi="Arial" w:cs="Arial"/>
+                <w:b w:val="0"/>
+                <w:sz w:val="19"/>
+              </w:rPr>
+            </w:r>
+          </w:p>
+        </w:tc>
+        <w:tc>
+          <w:tcPr>
+            <w:tcW w:type="dxa" w:w="510"/>
+          </w:tcPr>
+          <w:p>
+            <w:r>
+              <w:rPr>
+                <w:rFonts w:ascii="Arial" w:hAnsi="Arial" w:cs="Arial"/>
+                <w:b w:val="0"/>
+                <w:sz w:val="19"/>
+              </w:rPr>
+            </w:r>
+          </w:p>
+        </w:tc>
+        <w:tc>
+          <w:tcPr>
+            <w:tcW w:type="dxa" w:w="1474"/>
+          </w:tcPr>
+          <w:p>
+            <w:r>
+              <w:rPr>
+                <w:rFonts w:ascii="Arial" w:hAnsi="Arial" w:cs="Arial"/>
+                <w:b w:val="0"/>
+                <w:sz w:val="19"/>
+              </w:rPr>
+            </w:r>
+          </w:p>
+        </w:tc>
+        <w:tc>
+          <w:tcPr>
+            <w:tcW w:type="dxa" w:w="1531"/>
+          </w:tcPr>
+          <w:p>
+            <w:r>
+              <w:rPr>
+                <w:rFonts w:ascii="Arial" w:hAnsi="Arial" w:cs="Arial"/>
+                <w:b w:val="0"/>
+                <w:sz w:val="19"/>
+              </w:rPr>
+            </w:r>
+          </w:p>
+        </w:tc>
+      </w:tr>
+      <w:tr>
+        <w:tc>
+          <w:tcPr>
+            <w:tcW w:type="dxa" w:w="1531"/>
+          </w:tcPr>
+          <w:p>
+            <w:r>
+              <w:rPr>
+                <w:rFonts w:ascii="Arial" w:hAnsi="Arial" w:cs="Arial"/>
+                <w:b/>
+                <w:sz w:val="19"/>
+              </w:rPr>
+              <w:t>Sensors d'humitat del sòl</w:t>
+            </w:r>
+          </w:p>
+        </w:tc>
+        <w:tc>
+          <w:tcPr>
+            <w:tcW w:type="dxa" w:w="2608"/>
+          </w:tcPr>
+          <w:p>
+            <w:r>
+              <w:rPr>
+                <w:rFonts w:ascii="Arial" w:hAnsi="Arial" w:cs="Arial"/>
+                <w:b w:val="0"/>
+                <w:sz w:val="19"/>
+              </w:rPr>
+              <w:t>Segueixen el contingut d'aigua del sòl al llarg del perfil. Serveixen per comprovar la disponibilitat hídrica i per controlar que el reg deficitari s'aplica com estava previst.</w:t>
+            </w:r>
+          </w:p>
+        </w:tc>
+        <w:tc>
+          <w:tcPr>
+            <w:tcW w:type="dxa" w:w="1417"/>
+          </w:tcPr>
+          <w:p>
+            <w:r>
+              <w:rPr>
+                <w:rFonts w:ascii="Arial" w:hAnsi="Arial" w:cs="Arial"/>
+                <w:b w:val="0"/>
+                <w:sz w:val="19"/>
+              </w:rPr>
+            </w:r>
+          </w:p>
+        </w:tc>
+        <w:tc>
+          <w:tcPr>
+            <w:tcW w:type="dxa" w:w="510"/>
+          </w:tcPr>
+          <w:p>
+            <w:r>
+              <w:rPr>
+                <w:rFonts w:ascii="Arial" w:hAnsi="Arial" w:cs="Arial"/>
+                <w:b w:val="0"/>
+                <w:sz w:val="19"/>
+              </w:rPr>
+            </w:r>
+          </w:p>
+        </w:tc>
+        <w:tc>
+          <w:tcPr>
+            <w:tcW w:type="dxa" w:w="1474"/>
+          </w:tcPr>
+          <w:p>
+            <w:r>
+              <w:rPr>
+                <w:rFonts w:ascii="Arial" w:hAnsi="Arial" w:cs="Arial"/>
+                <w:b w:val="0"/>
+                <w:sz w:val="19"/>
+              </w:rPr>
+            </w:r>
+          </w:p>
+        </w:tc>
+        <w:tc>
+          <w:tcPr>
+            <w:tcW w:type="dxa" w:w="1531"/>
+          </w:tcPr>
+          <w:p>
+            <w:r>
+              <w:rPr>
+                <w:rFonts w:ascii="Arial" w:hAnsi="Arial" w:cs="Arial"/>
+                <w:b w:val="0"/>
+                <w:sz w:val="19"/>
+              </w:rPr>
+            </w:r>
+          </w:p>
+        </w:tc>
+      </w:tr>
+      <w:tr>
+        <w:tc>
+          <w:tcPr>
+            <w:tcW w:type="dxa" w:w="1531"/>
+          </w:tcPr>
+          <w:p>
+            <w:r>
+              <w:rPr>
+                <w:rFonts w:ascii="Arial" w:hAnsi="Arial" w:cs="Arial"/>
+                <w:b/>
+                <w:sz w:val="19"/>
+              </w:rPr>
+              <w:t>Dendròmetres</w:t>
+            </w:r>
+          </w:p>
+        </w:tc>
+        <w:tc>
+          <w:tcPr>
+            <w:tcW w:type="dxa" w:w="2608"/>
+          </w:tcPr>
+          <w:p>
+            <w:r>
+              <w:rPr>
+                <w:rFonts w:ascii="Arial" w:hAnsi="Arial" w:cs="Arial"/>
+                <w:b w:val="0"/>
+                <w:sz w:val="19"/>
+              </w:rPr>
+              <w:t>Registren les variacions del diàmetre del tronc, que són un indicador continu de l'estat hídric del cep i complementen les mesures puntuals de potencial hídric de tija.</w:t>
+            </w:r>
+          </w:p>
+        </w:tc>
+        <w:tc>
+          <w:tcPr>
+            <w:tcW w:type="dxa" w:w="1417"/>
+          </w:tcPr>
+          <w:p>
+            <w:r>
+              <w:rPr>
+                <w:rFonts w:ascii="Arial" w:hAnsi="Arial" w:cs="Arial"/>
+                <w:b w:val="0"/>
+                <w:sz w:val="19"/>
+              </w:rPr>
+            </w:r>
+          </w:p>
+        </w:tc>
+        <w:tc>
+          <w:tcPr>
+            <w:tcW w:type="dxa" w:w="510"/>
+          </w:tcPr>
+          <w:p>
+            <w:r>
+              <w:rPr>
+                <w:rFonts w:ascii="Arial" w:hAnsi="Arial" w:cs="Arial"/>
+                <w:b w:val="0"/>
+                <w:sz w:val="19"/>
+              </w:rPr>
+            </w:r>
+          </w:p>
+        </w:tc>
+        <w:tc>
+          <w:tcPr>
+            <w:tcW w:type="dxa" w:w="1474"/>
+          </w:tcPr>
+          <w:p>
+            <w:r>
+              <w:rPr>
+                <w:rFonts w:ascii="Arial" w:hAnsi="Arial" w:cs="Arial"/>
+                <w:b w:val="0"/>
+                <w:sz w:val="19"/>
+              </w:rPr>
+            </w:r>
+          </w:p>
+        </w:tc>
+        <w:tc>
+          <w:tcPr>
+            <w:tcW w:type="dxa" w:w="1531"/>
+          </w:tcPr>
+          <w:p>
+            <w:r>
+              <w:rPr>
+                <w:rFonts w:ascii="Arial" w:hAnsi="Arial" w:cs="Arial"/>
+                <w:b w:val="0"/>
+                <w:sz w:val="19"/>
+              </w:rPr>
+            </w:r>
+          </w:p>
+        </w:tc>
+      </w:tr>
+      <w:tr>
+        <w:tc>
+          <w:tcPr>
+            <w:tcW w:type="dxa" w:w="1531"/>
+          </w:tcPr>
+          <w:p>
+            <w:r>
+              <w:rPr>
+                <w:rFonts w:ascii="Arial" w:hAnsi="Arial" w:cs="Arial"/>
+                <w:b/>
+                <w:sz w:val="19"/>
+              </w:rPr>
+              <w:t>Estació meteorològica</w:t>
+            </w:r>
+          </w:p>
+        </w:tc>
+        <w:tc>
+          <w:tcPr>
+            <w:tcW w:type="dxa" w:w="2608"/>
+          </w:tcPr>
+          <w:p>
+            <w:r>
+              <w:rPr>
+                <w:rFonts w:ascii="Arial" w:hAnsi="Arial" w:cs="Arial"/>
+                <w:b w:val="0"/>
+                <w:sz w:val="19"/>
+              </w:rPr>
+              <w:t>Proporciona la temperatura de l'aire, la humitat relativa, el dèficit de pressió de vapor, la velocitat del vent i la radiació solar, que són entrades dels models TSEB i Shuttleworth–Wallace.</w:t>
+            </w:r>
+          </w:p>
+        </w:tc>
+        <w:tc>
+          <w:tcPr>
+            <w:tcW w:type="dxa" w:w="1417"/>
+          </w:tcPr>
+          <w:p>
+            <w:r>
+              <w:rPr>
+                <w:rFonts w:ascii="Arial" w:hAnsi="Arial" w:cs="Arial"/>
+                <w:b w:val="0"/>
+                <w:sz w:val="19"/>
+              </w:rPr>
+            </w:r>
+          </w:p>
+        </w:tc>
+        <w:tc>
+          <w:tcPr>
+            <w:tcW w:type="dxa" w:w="510"/>
+          </w:tcPr>
+          <w:p>
+            <w:r>
+              <w:rPr>
+                <w:rFonts w:ascii="Arial" w:hAnsi="Arial" w:cs="Arial"/>
+                <w:b w:val="0"/>
+                <w:sz w:val="19"/>
+              </w:rPr>
+            </w:r>
+          </w:p>
+        </w:tc>
+        <w:tc>
+          <w:tcPr>
+            <w:tcW w:type="dxa" w:w="1474"/>
+          </w:tcPr>
+          <w:p>
+            <w:r>
+              <w:rPr>
+                <w:rFonts w:ascii="Arial" w:hAnsi="Arial" w:cs="Arial"/>
+                <w:b w:val="0"/>
+                <w:sz w:val="19"/>
+              </w:rPr>
+            </w:r>
+          </w:p>
+        </w:tc>
+        <w:tc>
+          <w:tcPr>
+            <w:tcW w:type="dxa" w:w="1531"/>
+          </w:tcPr>
+          <w:p>
+            <w:r>
+              <w:rPr>
+                <w:rFonts w:ascii="Arial" w:hAnsi="Arial" w:cs="Arial"/>
+                <w:b w:val="0"/>
+                <w:sz w:val="19"/>
+              </w:rPr>
+            </w:r>
+          </w:p>
+        </w:tc>
+      </w:tr>
+      <w:tr>
+        <w:tc>
+          <w:tcPr>
+            <w:tcW w:type="dxa" w:w="1531"/>
+          </w:tcPr>
+          <w:p>
+            <w:r>
+              <w:rPr>
+                <w:rFonts w:ascii="Arial" w:hAnsi="Arial" w:cs="Arial"/>
+                <w:b/>
+                <w:sz w:val="19"/>
+              </w:rPr>
+              <w:t>[Altres sensors]</w:t>
+            </w:r>
+          </w:p>
+        </w:tc>
+        <w:tc>
+          <w:tcPr>
+            <w:tcW w:type="dxa" w:w="2608"/>
+          </w:tcPr>
+          <w:p>
+            <w:r>
+              <w:rPr>
+                <w:rFonts w:ascii="Arial" w:hAnsi="Arial" w:cs="Arial"/>
+                <w:b w:val="0"/>
+                <w:sz w:val="19"/>
+              </w:rPr>
+              <w:t>[Afegiu aquí qualsevol altre sensor de la parcel·la i indiqueu-ne la funció.]</w:t>
+            </w:r>
+          </w:p>
+        </w:tc>
+        <w:tc>
+          <w:tcPr>
+            <w:tcW w:type="dxa" w:w="1417"/>
+          </w:tcPr>
+          <w:p>
+            <w:r>
+              <w:rPr>
+                <w:rFonts w:ascii="Arial" w:hAnsi="Arial" w:cs="Arial"/>
+                <w:b w:val="0"/>
+                <w:sz w:val="19"/>
+              </w:rPr>
+            </w:r>
+          </w:p>
+        </w:tc>
+        <w:tc>
+          <w:tcPr>
+            <w:tcW w:type="dxa" w:w="510"/>
+          </w:tcPr>
+          <w:p>
+            <w:r>
+              <w:rPr>
+                <w:rFonts w:ascii="Arial" w:hAnsi="Arial" w:cs="Arial"/>
+                <w:b w:val="0"/>
+                <w:sz w:val="19"/>
+              </w:rPr>
+            </w:r>
+          </w:p>
+        </w:tc>
+        <w:tc>
+          <w:tcPr>
+            <w:tcW w:type="dxa" w:w="1474"/>
+          </w:tcPr>
+          <w:p>
+            <w:r>
+              <w:rPr>
+                <w:rFonts w:ascii="Arial" w:hAnsi="Arial" w:cs="Arial"/>
+                <w:b w:val="0"/>
+                <w:sz w:val="19"/>
+              </w:rPr>
+            </w:r>
+          </w:p>
+        </w:tc>
+        <w:tc>
+          <w:tcPr>
+            <w:tcW w:type="dxa" w:w="1531"/>
+          </w:tcPr>
+          <w:p>
+            <w:r>
+              <w:rPr>
+                <w:rFonts w:ascii="Arial" w:hAnsi="Arial" w:cs="Arial"/>
+                <w:b w:val="0"/>
+                <w:sz w:val="19"/>
+              </w:rPr>
+            </w:r>
+          </w:p>
+        </w:tc>
+      </w:tr>
+    </w:tbl>
+    <w:p>
+      <w:pPr>
         <w:jc w:val="left"/>
         <w:rPr>
           <w:lang w:val="es-ES"/>
@@ -6729,7 +7461,7 @@
           <w:sz w:val="22"/>
           <w:lang w:val="es-ES"/>
         </w:rPr>
-        <w:t>[A COMPLETAR] Model, fabricant i nombre de sensors de flux de saba i de cabalímetres; en quins tractaments i blocs estan col·locats; freqüència de registre i sistema d'adquisició de dades. Afegiu-hi la resta de sensors de la parcel·la (humitat del sòl, dendròmetres, estació meteorològica) amb la funció de cadascun.</w:t>
+        <w:t>[A COMPLETAR] Ompliu les columnes de model i fabricant, nombre d'unitats, ubicació per tractament i bloc, i freqüència i sistema de registre. Indiqueu també si les dades meteorològiques provenen d'una estació pròpia a la parcel·la o de l'estació de la Xarxa Agrometeorològica de Catalunya (XAC) més propera, tal com s'esmenta a l'apartat 4.6.</w:t>
       </w:r>
     </w:p>
     <w:p>
@@ -6760,7 +7492,7 @@
           <w:rFonts w:cs="Arial"/>
           <w:lang w:val="es-ES"/>
         </w:rPr>
-        <w:t>Es faran quatre vols de dron al voltant del migdia solar, repartits al llarg del cicle vegetatiu, per seguir l'evolució estacional del dosser i de l'estat hídric. El dron porta dues càmeres: una de multiespectral de sis bandes (Altum-PT), amb la regió del red-edge, per calcular índexs de vegetació i estimar el LAI i la fIPAR; i una de tèrmica (FLIR) per obtenir la temperatura de la superfície. Els vols es planifiquen amb un solapament frontal i lateral elevat per garantir una bona reconstrucció fotogramètrica, i s'hi inclouen targets de calibratge radiomètric i punts de control terrestre georeferenciats amb GPS. El calendari de vols i de mesures de camp associades es resumeix a la Taula 2.</w:t>
+        <w:t>Es faran quatre vols de dron al voltant del migdia solar, repartits al llarg del cicle vegetatiu, per seguir l'evolució estacional del dosser i de l'estat hídric. El dron porta dues càmeres: una de multiespectral de sis bandes (Altum-PT), amb la regió del red-edge, per calcular índexs de vegetació i estimar el LAI i la fIPAR; i una de tèrmica (FLIR) per obtenir la temperatura de la superfície. Els vols es planifiquen amb un solapament frontal i lateral elevat per garantir una bona reconstrucció fotogramètrica, i s'hi inclouen targets de calibratge radiomètric i punts de control terrestre georeferenciats amb GPS. El calendari de vols i de mesures de camp associades es resumeix a la Taula 3.</w:t>
       </w:r>
     </w:p>
     <w:p>
@@ -6819,7 +7551,7 @@
           <w:b/>
           <w:lang w:val="es-ES"/>
         </w:rPr>
-        <w:t>2</w:t>
+        <w:t>3</w:t>
       </w:r>
       <w:r>
         <w:rPr>
@@ -7290,7 +8022,7 @@
           <w:sz w:val="22"/>
           <w:lang w:val="es-ES"/>
         </w:rPr>
-        <w:t>[A CONCRETAR] Model de dron; especificacions de l'Altum-PT i de la càmera FLIR (bandes espectrals, resolució tèrmica, GSD a l'altura de vol); altura de vol i solapaments; dates exactes dels quatre vols i quina fase fenològica cobreix cadascun (a la Taula 2 només n'hi ha tres definides); nombre i distribució dels punts de control; programari de planificació de vol.</w:t>
+        <w:t>[A CONCRETAR] Model de dron; especificacions de l'Altum-PT i de la càmera FLIR (bandes espectrals, resolució tèrmica, GSD a l'altura de vol); altura de vol i solapaments; dates exactes dels quatre vols i quina fase fenològica cobreix cadascun (a la Taula 3 només n'hi ha tres definides); nombre i distribució dels punts de control; programari de planificació de vol.</w:t>
       </w:r>
     </w:p>
     <w:p>
@@ -7607,7 +8339,7 @@
           <w:rFonts w:cs="Arial"/>
           <w:lang w:val="es-ES"/>
         </w:rPr>
-        <w:t>A partir d'aquestes dues estimacions, l'índex d'estrès hídric del cultiu es defineix com CWSI = 1 − ETa/ETp (Idso et al., 1981; Jackson et al., 1981), i pren valors propers a 0 sense estrès i propers a 1 en estrès màxim. El CWSI obtingut per teledetecció es contrasta amb les mesures de Ψstem per avaluar-ne la capacitat de diagnòstic (Bellvert et al., 2014). La Taula 3 resumeix les entrades i les sortides principals de cada model.</w:t>
+        <w:t>A partir d'aquestes dues estimacions, l'índex d'estrès hídric del cultiu es defineix com CWSI = 1 − ETa/ETp (Idso et al., 1981; Jackson et al., 1981), i pren valors propers a 0 sense estrès i propers a 1 en estrès màxim. El CWSI obtingut per teledetecció es contrasta amb les mesures de Ψstem per avaluar-ne la capacitat de diagnòstic (Bellvert et al., 2014). La Taula 4 resumeix les entrades i les sortides principals de cada model.</w:t>
       </w:r>
     </w:p>
     <w:p>
@@ -7688,7 +8420,7 @@
           <w:b/>
           <w:lang w:val="es-ES"/>
         </w:rPr>
-        <w:t>3</w:t>
+        <w:t>4</w:t>
       </w:r>
       <w:r>
         <w:rPr>

</xml_diff>

<commit_message>
TFM: canviar la capçalera Nre. per Unitats a la taula de sensors
L'abreviatura Nre. no s'entenia prou. Es canvia per Unitats i s'ajusten les
amplades de les columnes.

Co-Authored-By: Claude Opus 5 <noreply@anthropic.com>
Claude-Session: https://claude.ai/code/session_015S8J5VNEjqUNJtc1c5qPf1
</commit_message>
<xml_diff>
--- a/TFM_Pau_Planes_IRTA_v3.docx
+++ b/TFM_Pau_Planes_IRTA_v3.docx
@@ -6828,7 +6828,7 @@
         </w:tc>
         <w:tc>
           <w:tcPr>
-            <w:tcW w:type="dxa" w:w="2608"/>
+            <w:tcW w:type="dxa" w:w="2381"/>
           </w:tcPr>
           <w:p>
             <w:pPr>
@@ -6864,7 +6864,7 @@
         </w:tc>
         <w:tc>
           <w:tcPr>
-            <w:tcW w:type="dxa" w:w="510"/>
+            <w:tcW w:type="dxa" w:w="737"/>
           </w:tcPr>
           <w:p>
             <w:pPr>
@@ -6876,7 +6876,7 @@
                 <w:b/>
                 <w:sz w:val="19"/>
               </w:rPr>
-              <w:t>Nre.</w:t>
+              <w:t>Unitats</w:t>
             </w:r>
           </w:p>
         </w:tc>
@@ -6935,7 +6935,7 @@
         </w:tc>
         <w:tc>
           <w:tcPr>
-            <w:tcW w:type="dxa" w:w="2608"/>
+            <w:tcW w:type="dxa" w:w="2381"/>
           </w:tcPr>
           <w:p>
             <w:r>
@@ -6964,7 +6964,7 @@
         </w:tc>
         <w:tc>
           <w:tcPr>
-            <w:tcW w:type="dxa" w:w="510"/>
+            <w:tcW w:type="dxa" w:w="737"/>
           </w:tcPr>
           <w:p>
             <w:r>
@@ -7023,7 +7023,7 @@
         </w:tc>
         <w:tc>
           <w:tcPr>
-            <w:tcW w:type="dxa" w:w="2608"/>
+            <w:tcW w:type="dxa" w:w="2381"/>
           </w:tcPr>
           <w:p>
             <w:r>
@@ -7052,7 +7052,7 @@
         </w:tc>
         <w:tc>
           <w:tcPr>
-            <w:tcW w:type="dxa" w:w="510"/>
+            <w:tcW w:type="dxa" w:w="737"/>
           </w:tcPr>
           <w:p>
             <w:r>
@@ -7111,7 +7111,7 @@
         </w:tc>
         <w:tc>
           <w:tcPr>
-            <w:tcW w:type="dxa" w:w="2608"/>
+            <w:tcW w:type="dxa" w:w="2381"/>
           </w:tcPr>
           <w:p>
             <w:r>
@@ -7140,7 +7140,7 @@
         </w:tc>
         <w:tc>
           <w:tcPr>
-            <w:tcW w:type="dxa" w:w="510"/>
+            <w:tcW w:type="dxa" w:w="737"/>
           </w:tcPr>
           <w:p>
             <w:r>
@@ -7199,7 +7199,7 @@
         </w:tc>
         <w:tc>
           <w:tcPr>
-            <w:tcW w:type="dxa" w:w="2608"/>
+            <w:tcW w:type="dxa" w:w="2381"/>
           </w:tcPr>
           <w:p>
             <w:r>
@@ -7228,7 +7228,7 @@
         </w:tc>
         <w:tc>
           <w:tcPr>
-            <w:tcW w:type="dxa" w:w="510"/>
+            <w:tcW w:type="dxa" w:w="737"/>
           </w:tcPr>
           <w:p>
             <w:r>
@@ -7287,7 +7287,7 @@
         </w:tc>
         <w:tc>
           <w:tcPr>
-            <w:tcW w:type="dxa" w:w="2608"/>
+            <w:tcW w:type="dxa" w:w="2381"/>
           </w:tcPr>
           <w:p>
             <w:r>
@@ -7316,7 +7316,7 @@
         </w:tc>
         <w:tc>
           <w:tcPr>
-            <w:tcW w:type="dxa" w:w="510"/>
+            <w:tcW w:type="dxa" w:w="737"/>
           </w:tcPr>
           <w:p>
             <w:r>
@@ -7375,7 +7375,7 @@
         </w:tc>
         <w:tc>
           <w:tcPr>
-            <w:tcW w:type="dxa" w:w="2608"/>
+            <w:tcW w:type="dxa" w:w="2381"/>
           </w:tcPr>
           <w:p>
             <w:r>
@@ -7404,7 +7404,7 @@
         </w:tc>
         <w:tc>
           <w:tcPr>
-            <w:tcW w:type="dxa" w:w="510"/>
+            <w:tcW w:type="dxa" w:w="737"/>
           </w:tcPr>
           <w:p>
             <w:r>

</xml_diff>

<commit_message>
TFM: afegir l'apartat del programa de reg i el criteri de verema
Crea l'apartat 4.4 amb el càlcul de la dosi a partir de l'ETo i el Kc, el reg
deficitari controlat des del verolat fins a la verema (25 % de la dosi, Ψstem
d'entre -11 i -12 bar), l'ajust individualitzat per igualar l'estat hídric
entre tractaments, el criteri de verema a 23,5 graus Brix per tractament i el
seguiment amb la plataforma Treetoscope.

Incorpora la Figura 6 (evolució del potencial hídric de tija) i la Figura 7
(interfície de Treetoscope), renumera els apartats 4.4-4.8 a 4.5-4.9 i
actualitza les crides i l'estructura del treball.

Co-Authored-By: Claude Opus 5 <noreply@anthropic.com>
Claude-Session: https://claude.ai/code/session_015S8J5VNEjqUNJtc1c5qPf1
</commit_message>
<xml_diff>
--- a/TFM_Pau_Planes_IRTA_v3.docx
+++ b/TFM_Pau_Planes_IRTA_v3.docx
@@ -4795,7 +4795,7 @@
           <w:rFonts w:cs="Arial"/>
           <w:lang w:val="es-ES"/>
         </w:rPr>
-        <w:t>El treball s'organitza en vuit capítols. Després d'aquesta introducció, el capítol 2 desenvolupa el marc teòric: els fonaments de l'evapotranspiració, els models de balanç energètic, les variables biofísiques del dosser, la teledetecció amb dron, els mètodes de mesura de la radiació PAR, l'efecte de la poda i els indicadors d'estrès hídric. El capítol 3 presenta els objectius i les hipòtesis. El capítol 4 detalla els materials i mètodes: àrea d'estudi, disseny experimental, sensors instal·lats, vols de dron, processament d'imatges, mesures de camp, models d'ET i anàlisi estadística. Els capítols 5 i 6 recullen els resultats i la seva discussió. El capítol 7 sintetitza les conclusions i el capítol 8 llista les referències bibliogràfiques.</w:t>
+        <w:t>El treball s'organitza en vuit capítols. Després d'aquesta introducció, el capítol 2 desenvolupa el marc teòric: els fonaments de l'evapotranspiració, els models de balanç energètic, les variables biofísiques del dosser, la teledetecció amb dron, els mètodes de mesura de la radiació PAR, l'efecte de la poda i els indicadors d'estrès hídric. El capítol 3 presenta els objectius i les hipòtesis. El capítol 4 detalla els materials i mètodes: àrea d'estudi, disseny experimental, sensors instal·lats, programa de reg, vols de dron, processament d'imatges, mesures de camp, models d'ET i anàlisi estadística. Els capítols 5 i 6 recullen els resultats i la seva discussió. El capítol 7 sintetitza les conclusions i el capítol 8 llista les referències bibliogràfiques.</w:t>
       </w:r>
     </w:p>
     <w:p>
@@ -7461,7 +7461,368 @@
           <w:sz w:val="22"/>
           <w:lang w:val="es-ES"/>
         </w:rPr>
-        <w:t>[A COMPLETAR] Ompliu les columnes de model i fabricant, nombre d'unitats, ubicació per tractament i bloc, i freqüència i sistema de registre. Indiqueu també si les dades meteorològiques provenen d'una estació pròpia a la parcel·la o de l'estació de la Xarxa Agrometeorològica de Catalunya (XAC) més propera, tal com s'esmenta a l'apartat 4.6.</w:t>
+        <w:t>[A COMPLETAR] Ompliu les columnes de model i fabricant, nombre d'unitats, ubicació per tractament i bloc, i freqüència i sistema de registre. Indiqueu també si les dades meteorològiques provenen d'una estació pròpia a la parcel·la o de l'estació de la Xarxa Agrometeorològica de Catalunya (XAC) més propera, tal com s'esmenta a l'apartat 4.7.</w:t>
+      </w:r>
+    </w:p>
+    <w:p>
+      <w:pPr>
+        <w:pStyle w:val="Ttulo2"/>
+        <w:rPr>
+          <w:lang w:val="es-ES"/>
+        </w:rPr>
+      </w:pPr>
+      <w:r>
+        <w:rPr>
+          <w:rFonts w:ascii="Arial" w:hAnsi="Arial" w:cs="Arial"/>
+          <w:b/>
+          <w:i w:val="0"/>
+          <w:sz w:val="26"/>
+          <w:lang w:val="es-ES"/>
+        </w:rPr>
+        <w:t>4.4. Programa de reg i criteri de verema</w:t>
+      </w:r>
+    </w:p>
+    <w:p>
+      <w:pPr>
+        <w:rPr>
+          <w:lang w:val="es-ES"/>
+        </w:rPr>
+      </w:pPr>
+      <w:r>
+        <w:rPr>
+          <w:lang w:val="es-ES"/>
+        </w:rPr>
+        <w:t>La dosi de reg es calcula a partir de l'evapotranspiració de referència (ETo) i del coeficient de cultiu (Kc), segons la relació ETc = ETo × Kc. L'ETo es deriva de les variables meteorològiques de la zona (temperatura de l'aire, humitat relativa, velocitat del vent i radiació solar), mentre que el Kc s'ajusta amb els valors obtinguts en campanyes anteriors de l'assaig i amb el vigor que mostra cada tractament. Tant l'aigua consumida com l'aplicada s'expressen en làmina d'aigua, on 1 mm equival a 1 l/m².</w:t>
+      </w:r>
+    </w:p>
+    <w:p>
+      <w:pPr>
+        <w:rPr>
+          <w:lang w:val="es-ES"/>
+        </w:rPr>
+      </w:pPr>
+      <w:r>
+        <w:rPr>
+          <w:lang w:val="es-ES"/>
+        </w:rPr>
+        <w:t>Des del verolat, que el 2026 es va produir cap al 22 de juliol, i fins a la verema s'aplica una estratègia de reg deficitari controlat (RDC). En aquesta fase el reg es redueix fins al 25 % de la dosi que s'aplicava fins aleshores, cosa que fa baixar el potencial hídric de tija al migdia fins a valors d'entre −11 i −12 bar. El dèficit es manté dins d'aquest interval perquè el cep pugui refer reserves: la brotació i la collita de l'any següent depenen de les reserves acumulades durant la campanya actual, de manera que un dèficit més sever penalitzaria la producció de l'any vinent.</w:t>
+      </w:r>
+    </w:p>
+    <w:p>
+      <w:pPr>
+        <w:rPr>
+          <w:lang w:val="es-ES"/>
+        </w:rPr>
+      </w:pPr>
+      <w:r>
+        <w:rPr>
+          <w:lang w:val="es-ES"/>
+        </w:rPr>
+        <w:t>Cada tractament es rega de manera independent i la dosi es reajusta al llarg de tot el període perquè els cinc tractaments es mantinguin en el mateix potencial hídric de tija, sense llindars d'estrès diferents entre ells. Amb aquest criteri, les diferències que s'observin en l'ETa i en les variables del dosser es poden atribuir a la mida i a l'arquitectura de la capçada. La Figura 6 mostra l'evolució del potencial hídric de tija al migdia en la campanya anterior, amb el descens que provoca la imposició del dèficit a partir del verolat.</w:t>
+      </w:r>
+    </w:p>
+    <w:p>
+      <w:pPr>
+        <w:jc w:val="center"/>
+        <w:rPr>
+          <w:lang w:val="es-ES"/>
+        </w:rPr>
+      </w:pPr>
+      <w:r>
+        <w:drawing>
+          <wp:inline xmlns:a="http://schemas.openxmlformats.org/drawingml/2006/main" xmlns:pic="http://schemas.openxmlformats.org/drawingml/2006/picture">
+            <wp:extent cx="5220000" cy="2867092"/>
+            <wp:docPr id="2066959539" name="Picture 2066959539"/>
+            <wp:cNvGraphicFramePr>
+              <a:graphicFrameLocks noChangeAspect="1"/>
+            </wp:cNvGraphicFramePr>
+            <a:graphic>
+              <a:graphicData uri="http://schemas.openxmlformats.org/drawingml/2006/picture">
+                <pic:pic>
+                  <pic:nvPicPr>
+                    <pic:cNvPr id="0" name="fig6_psi_stem.png"/>
+                    <pic:cNvPicPr/>
+                  </pic:nvPicPr>
+                  <pic:blipFill>
+                    <a:blip r:embed="rId28"/>
+                    <a:stretch>
+                      <a:fillRect/>
+                    </a:stretch>
+                  </pic:blipFill>
+                  <pic:spPr>
+                    <a:xfrm>
+                      <a:off x="0" y="0"/>
+                      <a:ext cx="5220000" cy="2867092"/>
+                    </a:xfrm>
+                    <a:prstGeom prst="rect"/>
+                  </pic:spPr>
+                </pic:pic>
+              </a:graphicData>
+            </a:graphic>
+          </wp:inline>
+        </w:drawing>
+      </w:r>
+    </w:p>
+    <w:p>
+      <w:pPr>
+        <w:pStyle w:val="Descripcin"/>
+        <w:jc w:val="center"/>
+        <w:rPr>
+          <w:lang w:val="es-ES"/>
+        </w:rPr>
+      </w:pPr>
+      <w:r>
+        <w:rPr>
+          <w:rFonts w:ascii="Arial" w:hAnsi="Arial" w:cs="Arial"/>
+          <w:b/>
+          <w:i w:val="0"/>
+          <w:sz w:val="20"/>
+        </w:rPr>
+        <w:t xml:space="preserve">Figura </w:t>
+      </w:r>
+      <w:r>
+        <w:rPr>
+          <w:rFonts w:ascii="Arial" w:hAnsi="Arial" w:cs="Arial"/>
+          <w:b/>
+          <w:i w:val="0"/>
+          <w:sz w:val="20"/>
+        </w:rPr>
+        <w:fldChar w:fldCharType="begin"/>
+      </w:r>
+      <w:r>
+        <w:rPr>
+          <w:rFonts w:ascii="Arial" w:hAnsi="Arial" w:cs="Arial"/>
+          <w:b/>
+          <w:i w:val="0"/>
+          <w:sz w:val="20"/>
+        </w:rPr>
+        <w:instrText xml:space="preserve"> SEQ Figura \* ARABIC </w:instrText>
+      </w:r>
+      <w:r>
+        <w:rPr>
+          <w:rFonts w:ascii="Arial" w:hAnsi="Arial" w:cs="Arial"/>
+          <w:b/>
+          <w:i w:val="0"/>
+          <w:sz w:val="20"/>
+        </w:rPr>
+        <w:fldChar w:fldCharType="separate"/>
+      </w:r>
+      <w:r>
+        <w:rPr>
+          <w:rFonts w:ascii="Arial" w:hAnsi="Arial" w:cs="Arial"/>
+          <w:b/>
+          <w:i w:val="0"/>
+          <w:sz w:val="20"/>
+        </w:rPr>
+        <w:t>6</w:t>
+      </w:r>
+      <w:r>
+        <w:rPr>
+          <w:rFonts w:ascii="Arial" w:hAnsi="Arial" w:cs="Arial"/>
+          <w:b/>
+          <w:i w:val="0"/>
+          <w:sz w:val="20"/>
+        </w:rPr>
+        <w:fldChar w:fldCharType="end"/>
+      </w:r>
+      <w:r>
+        <w:rPr>
+          <w:rFonts w:ascii="Arial" w:hAnsi="Arial" w:cs="Arial"/>
+          <w:b w:val="0"/>
+          <w:i w:val="0"/>
+          <w:sz w:val="20"/>
+        </w:rPr>
+        <w:t xml:space="preserve">. Evolució del potencial hídric de tija al migdia dels cinc tractaments de maneig de capçada durant la campanya anterior, amb el moment del verolat i les dates de verema de cada tractament. </w:t>
+      </w:r>
+      <w:r>
+        <w:rPr>
+          <w:rFonts w:ascii="Arial" w:hAnsi="Arial" w:cs="Arial"/>
+          <w:b w:val="0"/>
+          <w:i/>
+          <w:sz w:val="20"/>
+        </w:rPr>
+        <w:t>Font: Blanco et al. (2025).</w:t>
+      </w:r>
+    </w:p>
+    <w:p>
+      <w:pPr>
+        <w:rPr>
+          <w:lang w:val="es-ES"/>
+        </w:rPr>
+      </w:pPr>
+      <w:r>
+        <w:rPr>
+          <w:lang w:val="es-ES"/>
+        </w:rPr>
+        <w:t>La verema comença a principis de setembre i cada tractament es collita per separat quan arriba a 23,5 °Brix. Els tractaments que encara no hi han arribat es continuen regant i es deixen madurar fins que assoleixen aquest valor. El criteri segueix la pràctica del sector: si tots els tractaments es veremessin el mateix dia, només un estaria dins del rang òptim de maduració i la resta quedarien sobremadurats o poc madurs, i la comparació entre tractaments no seria vàlida. En la campanya anterior, els tractaments d'esporga severa (ES+DV i ES) van avançar la verema vuit dies respecte del maneig comercial (EM), l'esporga lleugera (EL) no la va modificar i el tractament sense esporga (SE) va endarrerir la maduresa sis dies (Blanco et al., 2025).</w:t>
+      </w:r>
+    </w:p>
+    <w:p>
+      <w:pPr>
+        <w:rPr>
+          <w:lang w:val="es-ES"/>
+        </w:rPr>
+      </w:pPr>
+      <w:r>
+        <w:rPr>
+          <w:lang w:val="es-ES"/>
+        </w:rPr>
+        <w:t>El seguiment del reg i del consum es gestiona amb la plataforma Treetoscope, que integra les lectures dels sensors de flux de saba i dels cabalímetres i les expressa en làmina d'aigua. Per a cada bloc monitorat, la plataforma dona el consum real del dia anterior, la necessitat de reg del dia (en mm i en temps de reg), l'últim reg aplicat i la pluja registrada, i en representa l'evolució al costat de l'ETo i d'un indicador d'estrès (Figura 7). Aquests registres són la base per ajustar la dosi de cada tractament i, en aquest treball, la referència amb què es contrasta l'ETa estimada per teledetecció.</w:t>
+      </w:r>
+    </w:p>
+    <w:p>
+      <w:pPr>
+        <w:jc w:val="center"/>
+        <w:rPr>
+          <w:lang w:val="es-ES"/>
+        </w:rPr>
+      </w:pPr>
+      <w:r>
+        <w:drawing>
+          <wp:inline xmlns:a="http://schemas.openxmlformats.org/drawingml/2006/main" xmlns:pic="http://schemas.openxmlformats.org/drawingml/2006/picture">
+            <wp:extent cx="5400000" cy="2683090"/>
+            <wp:docPr id="2066959540" name="Picture 2066959540"/>
+            <wp:cNvGraphicFramePr>
+              <a:graphicFrameLocks noChangeAspect="1"/>
+            </wp:cNvGraphicFramePr>
+            <a:graphic>
+              <a:graphicData uri="http://schemas.openxmlformats.org/drawingml/2006/picture">
+                <pic:pic>
+                  <pic:nvPicPr>
+                    <pic:cNvPr id="0" name="fig7_treetoscope.png"/>
+                    <pic:cNvPicPr/>
+                  </pic:nvPicPr>
+                  <pic:blipFill>
+                    <a:blip r:embed="rId29"/>
+                    <a:stretch>
+                      <a:fillRect/>
+                    </a:stretch>
+                  </pic:blipFill>
+                  <pic:spPr>
+                    <a:xfrm>
+                      <a:off x="0" y="0"/>
+                      <a:ext cx="5400000" cy="2683090"/>
+                    </a:xfrm>
+                    <a:prstGeom prst="rect"/>
+                  </pic:spPr>
+                </pic:pic>
+              </a:graphicData>
+            </a:graphic>
+          </wp:inline>
+        </w:drawing>
+      </w:r>
+    </w:p>
+    <w:p>
+      <w:pPr>
+        <w:pStyle w:val="Descripcin"/>
+        <w:jc w:val="center"/>
+        <w:rPr>
+          <w:lang w:val="es-ES"/>
+        </w:rPr>
+      </w:pPr>
+      <w:r>
+        <w:rPr>
+          <w:rFonts w:ascii="Arial" w:hAnsi="Arial" w:cs="Arial"/>
+          <w:b/>
+          <w:i w:val="0"/>
+          <w:sz w:val="20"/>
+        </w:rPr>
+        <w:t xml:space="preserve">Figura </w:t>
+      </w:r>
+      <w:r>
+        <w:rPr>
+          <w:rFonts w:ascii="Arial" w:hAnsi="Arial" w:cs="Arial"/>
+          <w:b/>
+          <w:i w:val="0"/>
+          <w:sz w:val="20"/>
+        </w:rPr>
+        <w:fldChar w:fldCharType="begin"/>
+      </w:r>
+      <w:r>
+        <w:rPr>
+          <w:rFonts w:ascii="Arial" w:hAnsi="Arial" w:cs="Arial"/>
+          <w:b/>
+          <w:i w:val="0"/>
+          <w:sz w:val="20"/>
+        </w:rPr>
+        <w:instrText xml:space="preserve"> SEQ Figura \* ARABIC </w:instrText>
+      </w:r>
+      <w:r>
+        <w:rPr>
+          <w:rFonts w:ascii="Arial" w:hAnsi="Arial" w:cs="Arial"/>
+          <w:b/>
+          <w:i w:val="0"/>
+          <w:sz w:val="20"/>
+        </w:rPr>
+        <w:fldChar w:fldCharType="separate"/>
+      </w:r>
+      <w:r>
+        <w:rPr>
+          <w:rFonts w:ascii="Arial" w:hAnsi="Arial" w:cs="Arial"/>
+          <w:b/>
+          <w:i w:val="0"/>
+          <w:sz w:val="20"/>
+        </w:rPr>
+        <w:t>7</w:t>
+      </w:r>
+      <w:r>
+        <w:rPr>
+          <w:rFonts w:ascii="Arial" w:hAnsi="Arial" w:cs="Arial"/>
+          <w:b/>
+          <w:i w:val="0"/>
+          <w:sz w:val="20"/>
+        </w:rPr>
+        <w:fldChar w:fldCharType="end"/>
+      </w:r>
+      <w:r>
+        <w:rPr>
+          <w:rFonts w:ascii="Arial" w:hAnsi="Arial" w:cs="Arial"/>
+          <w:b w:val="0"/>
+          <w:i w:val="0"/>
+          <w:sz w:val="20"/>
+        </w:rPr>
+        <w:t xml:space="preserve">. Interfície de la plataforma Treetoscope per a la parcel·la de vinya de l'IRTA: consum real del dia anterior, necessitat de reg del dia, últim reg aplicat i evolució del consum al costat de l'ETo, el reg, la pluja i l'indicador d'estrès. </w:t>
+      </w:r>
+      <w:r>
+        <w:rPr>
+          <w:rFonts w:ascii="Arial" w:hAnsi="Arial" w:cs="Arial"/>
+          <w:b w:val="0"/>
+          <w:i/>
+          <w:sz w:val="20"/>
+        </w:rPr>
+        <w:t>Font: captura de pantalla de la plataforma Treetoscope.</w:t>
+      </w:r>
+    </w:p>
+    <w:p>
+      <w:pPr>
+        <w:rPr>
+          <w:lang w:val="es-ES"/>
+        </w:rPr>
+      </w:pPr>
+      <w:r>
+        <w:rPr>
+          <w:i/>
+          <w:color w:val="B00000"/>
+          <w:sz w:val="22"/>
+          <w:lang w:val="es-ES"/>
+        </w:rPr>
+        <w:t>[A VERIFICAR] La Figura 6 correspon a la campanya anterior, en què la verema es va fer a 23 °Brix, mentre que el criteri d'aquesta campanya és de 23,5 °Brix. Confirmeu quin valor cal indicar a cada lloc.</w:t>
+      </w:r>
+    </w:p>
+    <w:p>
+      <w:pPr>
+        <w:rPr>
+          <w:lang w:val="es-ES"/>
+        </w:rPr>
+      </w:pPr>
+      <w:r>
+        <w:rPr>
+          <w:i/>
+          <w:color w:val="B00000"/>
+          <w:sz w:val="22"/>
+          <w:lang w:val="es-ES"/>
+        </w:rPr>
+        <w:t>[A COMPLETAR] Indiqueu la dosi de reg aplicada abans del verolat i el volum total aplicat per tractament durant la campanya. Comproveu també quins blocs es monitoren a Treetoscope: a la captura de la Figura 7 només n'hi apareixen tres, mentre que l'assaig té cinc tractaments.</w:t>
       </w:r>
     </w:p>
     <w:p>
@@ -7477,7 +7838,7 @@
           <w:rFonts w:ascii="Arial" w:hAnsi="Arial" w:cs="Arial"/>
           <w:lang w:val="es-ES"/>
         </w:rPr>
-        <w:t>4.4. Vols de dron i càmeres</w:t>
+        <w:t>4.5. Vols de dron i càmeres</w:t>
       </w:r>
       <w:bookmarkEnd w:id="28"/>
     </w:p>
@@ -8039,7 +8400,7 @@
           <w:rFonts w:ascii="Arial" w:hAnsi="Arial" w:cs="Arial"/>
           <w:lang w:val="es-ES"/>
         </w:rPr>
-        <w:t>4.5. Processament fotogramètric i d'imatges</w:t>
+        <w:t>4.6. Processament fotogramètric i d'imatges</w:t>
       </w:r>
       <w:bookmarkEnd w:id="29"/>
     </w:p>
@@ -8103,7 +8464,7 @@
           <w:rFonts w:ascii="Arial" w:hAnsi="Arial" w:cs="Arial"/>
           <w:lang w:val="es-ES"/>
         </w:rPr>
-        <w:t>4.6. Mesures de camp i validació</w:t>
+        <w:t>4.7. Mesures de camp i validació</w:t>
       </w:r>
       <w:bookmarkEnd w:id="30"/>
     </w:p>
@@ -8207,7 +8568,7 @@
           <w:sz w:val="24"/>
           <w:lang w:val="es-ES"/>
         </w:rPr>
-        <w:t>4.6.1. Mesura de la fPAR i del LAI amb el ceptòmetre AccuPAR LP-80</w:t>
+        <w:t>4.7.1. Mesura de la fPAR i del LAI amb el ceptòmetre AccuPAR LP-80</w:t>
       </w:r>
     </w:p>
     <w:p>
@@ -8302,7 +8663,7 @@
           <w:rFonts w:ascii="Arial" w:hAnsi="Arial" w:cs="Arial"/>
           <w:lang w:val="es-ES"/>
         </w:rPr>
-        <w:t>4.7. Models d'evapotranspiració i càlcul del CWSI</w:t>
+        <w:t>4.8. Models d'evapotranspiració i càlcul del CWSI</w:t>
       </w:r>
       <w:bookmarkEnd w:id="31"/>
     </w:p>
@@ -8713,7 +9074,7 @@
           <w:highlight w:val="yellow"/>
           <w:lang w:val="es-ES"/>
         </w:rPr>
-        <w:t>4.8. Anàlisi estadística</w:t>
+        <w:t>4.9. Anàlisi estadística</w:t>
       </w:r>
       <w:bookmarkEnd w:id="32"/>
     </w:p>

</xml_diff>